<commit_message>
Report summary: call out actual funding rounds instead of Specter growth stage
Co-authored-by: Cursor <cursoragent@cursor.com>
</commit_message>
<xml_diff>
--- a/output/Friedkin_AI_Ops_Exercise_-_Data_2026-06-08/investor_brief.docx
+++ b/output/Friedkin_AI_Ops_Exercise_-_Data_2026-06-08/investor_brief.docx
@@ -155,7 +155,7 @@
                 <w:color w:val="1A1A1A"/>
                 <w:sz w:val="20"/>
               </w:rPr>
-              <w:t>Stages</w:t>
+              <w:t>Funding rounds</w:t>
             </w:r>
           </w:p>
         </w:tc>
@@ -172,7 +172,7 @@
                 <w:color w:val="000000"/>
                 <w:sz w:val="20"/>
               </w:rPr>
-              <w:t>Early Stage (9), Growth Stage (6)</w:t>
+              <w:t>Series A (12), Series B (3)</w:t>
             </w:r>
           </w:p>
         </w:tc>

</xml_diff>